<commit_message>
add datasets, point analysis, update draft
</commit_message>
<xml_diff>
--- a/chapter 1 third draft.docx
+++ b/chapter 1 third draft.docx
@@ -7827,7 +7827,7 @@
         <w:pStyle w:val="CommentText"/>
         <w:numPr>
           <w:ilvl w:val="0"/>
-          <w:numId w:val="13"/>
+          <w:numId w:val="15"/>
         </w:numPr>
       </w:pPr>
       <w:r>
@@ -7845,11 +7845,59 @@
         <w:pStyle w:val="CommentText"/>
         <w:numPr>
           <w:ilvl w:val="0"/>
-          <w:numId w:val="13"/>
+          <w:numId w:val="15"/>
         </w:numPr>
       </w:pPr>
       <w:r>
-        <w:t>Point extraction vs coordinate buffering</w:t>
+        <w:t>Point extraction vs coordinate buffering, with two modules each.</w:t>
+      </w:r>
+    </w:p>
+    <w:p>
+      <w:pPr>
+        <w:pStyle w:val="CommentText"/>
+        <w:numPr>
+          <w:ilvl w:val="0"/>
+          <w:numId w:val="15"/>
+        </w:numPr>
+      </w:pPr>
+      <w:r>
+        <w:t>This package relies on a number of dependencies.</w:t>
+      </w:r>
+    </w:p>
+    <w:p>
+      <w:pPr>
+        <w:pStyle w:val="CommentText"/>
+        <w:ind w:left="300"/>
+      </w:pPr>
+      <w:r>
+        <w:t>Ipywidgets is the foundation</w:t>
+      </w:r>
+    </w:p>
+    <w:p>
+      <w:pPr>
+        <w:pStyle w:val="CommentText"/>
+        <w:ind w:left="300"/>
+      </w:pPr>
+      <w:r>
+        <w:t>Packages used in all 4 modules</w:t>
+      </w:r>
+    </w:p>
+    <w:p>
+      <w:pPr>
+        <w:pStyle w:val="CommentText"/>
+        <w:ind w:left="300"/>
+      </w:pPr>
+      <w:r>
+        <w:t>Point extraction only packages (significant because it is not called in the buffering approaches to protect sensitive plot locations)</w:t>
+      </w:r>
+    </w:p>
+    <w:p>
+      <w:pPr>
+        <w:pStyle w:val="CommentText"/>
+        <w:ind w:left="300"/>
+      </w:pPr>
+      <w:r>
+        <w:t>Buffering approach packages</w:t>
       </w:r>
     </w:p>
   </w:comment>
@@ -8229,6 +8277,92 @@
     </w:lvl>
   </w:abstractNum>
   <w:abstractNum w:abstractNumId="3" w15:restartNumberingAfterBreak="0">
+    <w:nsid w:val="15F7473F"/>
+    <w:multiLevelType w:val="hybridMultilevel"/>
+    <w:tmpl w:val="E2882020"/>
+    <w:lvl w:ilvl="0" w:tplc="B344B8B0">
+      <w:start w:val="1"/>
+      <w:numFmt w:val="decimal"/>
+      <w:lvlText w:val="%1."/>
+      <w:lvlJc w:val="left"/>
+      <w:pPr>
+        <w:ind w:left="1020" w:hanging="360"/>
+      </w:pPr>
+    </w:lvl>
+    <w:lvl w:ilvl="1" w:tplc="C00660E0">
+      <w:start w:val="1"/>
+      <w:numFmt w:val="decimal"/>
+      <w:lvlText w:val="%2."/>
+      <w:lvlJc w:val="left"/>
+      <w:pPr>
+        <w:ind w:left="1020" w:hanging="360"/>
+      </w:pPr>
+    </w:lvl>
+    <w:lvl w:ilvl="2" w:tplc="E3B64306">
+      <w:start w:val="1"/>
+      <w:numFmt w:val="decimal"/>
+      <w:lvlText w:val="%3."/>
+      <w:lvlJc w:val="left"/>
+      <w:pPr>
+        <w:ind w:left="1020" w:hanging="360"/>
+      </w:pPr>
+    </w:lvl>
+    <w:lvl w:ilvl="3" w:tplc="B7D61B60">
+      <w:start w:val="1"/>
+      <w:numFmt w:val="decimal"/>
+      <w:lvlText w:val="%4."/>
+      <w:lvlJc w:val="left"/>
+      <w:pPr>
+        <w:ind w:left="1020" w:hanging="360"/>
+      </w:pPr>
+    </w:lvl>
+    <w:lvl w:ilvl="4" w:tplc="B5A2B1F0">
+      <w:start w:val="1"/>
+      <w:numFmt w:val="decimal"/>
+      <w:lvlText w:val="%5."/>
+      <w:lvlJc w:val="left"/>
+      <w:pPr>
+        <w:ind w:left="1020" w:hanging="360"/>
+      </w:pPr>
+    </w:lvl>
+    <w:lvl w:ilvl="5" w:tplc="E2A20B1C">
+      <w:start w:val="1"/>
+      <w:numFmt w:val="decimal"/>
+      <w:lvlText w:val="%6."/>
+      <w:lvlJc w:val="left"/>
+      <w:pPr>
+        <w:ind w:left="1020" w:hanging="360"/>
+      </w:pPr>
+    </w:lvl>
+    <w:lvl w:ilvl="6" w:tplc="6F7074CC">
+      <w:start w:val="1"/>
+      <w:numFmt w:val="decimal"/>
+      <w:lvlText w:val="%7."/>
+      <w:lvlJc w:val="left"/>
+      <w:pPr>
+        <w:ind w:left="1020" w:hanging="360"/>
+      </w:pPr>
+    </w:lvl>
+    <w:lvl w:ilvl="7" w:tplc="4536AF52">
+      <w:start w:val="1"/>
+      <w:numFmt w:val="decimal"/>
+      <w:lvlText w:val="%8."/>
+      <w:lvlJc w:val="left"/>
+      <w:pPr>
+        <w:ind w:left="1020" w:hanging="360"/>
+      </w:pPr>
+    </w:lvl>
+    <w:lvl w:ilvl="8" w:tplc="607283B2">
+      <w:start w:val="1"/>
+      <w:numFmt w:val="decimal"/>
+      <w:lvlText w:val="%9."/>
+      <w:lvlJc w:val="left"/>
+      <w:pPr>
+        <w:ind w:left="1020" w:hanging="360"/>
+      </w:pPr>
+    </w:lvl>
+  </w:abstractNum>
+  <w:abstractNum w:abstractNumId="4" w15:restartNumberingAfterBreak="0">
     <w:nsid w:val="1C065194"/>
     <w:multiLevelType w:val="hybridMultilevel"/>
     <w:tmpl w:val="E0BE92D6"/>
@@ -8314,7 +8448,7 @@
       </w:pPr>
     </w:lvl>
   </w:abstractNum>
-  <w:abstractNum w:abstractNumId="4" w15:restartNumberingAfterBreak="0">
+  <w:abstractNum w:abstractNumId="5" w15:restartNumberingAfterBreak="0">
     <w:nsid w:val="1F9A0334"/>
     <w:multiLevelType w:val="hybridMultilevel"/>
     <w:tmpl w:val="212E4F00"/>
@@ -8400,7 +8534,7 @@
       </w:pPr>
     </w:lvl>
   </w:abstractNum>
-  <w:abstractNum w:abstractNumId="5" w15:restartNumberingAfterBreak="0">
+  <w:abstractNum w:abstractNumId="6" w15:restartNumberingAfterBreak="0">
     <w:nsid w:val="284B013F"/>
     <w:multiLevelType w:val="hybridMultilevel"/>
     <w:tmpl w:val="1D521728"/>
@@ -8489,7 +8623,7 @@
       </w:pPr>
     </w:lvl>
   </w:abstractNum>
-  <w:abstractNum w:abstractNumId="6" w15:restartNumberingAfterBreak="0">
+  <w:abstractNum w:abstractNumId="7" w15:restartNumberingAfterBreak="0">
     <w:nsid w:val="291546A9"/>
     <w:multiLevelType w:val="hybridMultilevel"/>
     <w:tmpl w:val="F572B006"/>
@@ -8575,7 +8709,7 @@
       </w:pPr>
     </w:lvl>
   </w:abstractNum>
-  <w:abstractNum w:abstractNumId="7" w15:restartNumberingAfterBreak="0">
+  <w:abstractNum w:abstractNumId="8" w15:restartNumberingAfterBreak="0">
     <w:nsid w:val="360C35C9"/>
     <w:multiLevelType w:val="hybridMultilevel"/>
     <w:tmpl w:val="2BFA9322"/>
@@ -8687,7 +8821,7 @@
       </w:rPr>
     </w:lvl>
   </w:abstractNum>
-  <w:abstractNum w:abstractNumId="8" w15:restartNumberingAfterBreak="0">
+  <w:abstractNum w:abstractNumId="9" w15:restartNumberingAfterBreak="0">
     <w:nsid w:val="3DA63F1D"/>
     <w:multiLevelType w:val="hybridMultilevel"/>
     <w:tmpl w:val="02CEE19E"/>
@@ -8773,7 +8907,7 @@
       </w:pPr>
     </w:lvl>
   </w:abstractNum>
-  <w:abstractNum w:abstractNumId="9" w15:restartNumberingAfterBreak="0">
+  <w:abstractNum w:abstractNumId="10" w15:restartNumberingAfterBreak="0">
     <w:nsid w:val="5AA827AE"/>
     <w:multiLevelType w:val="hybridMultilevel"/>
     <w:tmpl w:val="CE285358"/>
@@ -8859,7 +8993,7 @@
       </w:pPr>
     </w:lvl>
   </w:abstractNum>
-  <w:abstractNum w:abstractNumId="10" w15:restartNumberingAfterBreak="0">
+  <w:abstractNum w:abstractNumId="11" w15:restartNumberingAfterBreak="0">
     <w:nsid w:val="601A01B5"/>
     <w:multiLevelType w:val="hybridMultilevel"/>
     <w:tmpl w:val="3E9E9886"/>
@@ -8945,7 +9079,7 @@
       </w:pPr>
     </w:lvl>
   </w:abstractNum>
-  <w:abstractNum w:abstractNumId="11" w15:restartNumberingAfterBreak="0">
+  <w:abstractNum w:abstractNumId="12" w15:restartNumberingAfterBreak="0">
     <w:nsid w:val="6E31112B"/>
     <w:multiLevelType w:val="hybridMultilevel"/>
     <w:tmpl w:val="985A6064"/>
@@ -9031,7 +9165,7 @@
       </w:pPr>
     </w:lvl>
   </w:abstractNum>
-  <w:abstractNum w:abstractNumId="12" w15:restartNumberingAfterBreak="0">
+  <w:abstractNum w:abstractNumId="13" w15:restartNumberingAfterBreak="0">
     <w:nsid w:val="787D2C07"/>
     <w:multiLevelType w:val="hybridMultilevel"/>
     <w:tmpl w:val="88B8A23C"/>
@@ -9117,7 +9251,7 @@
       </w:pPr>
     </w:lvl>
   </w:abstractNum>
-  <w:abstractNum w:abstractNumId="13" w15:restartNumberingAfterBreak="0">
+  <w:abstractNum w:abstractNumId="14" w15:restartNumberingAfterBreak="0">
     <w:nsid w:val="7FDA32EC"/>
     <w:multiLevelType w:val="hybridMultilevel"/>
     <w:tmpl w:val="8A5696EC"/>
@@ -9204,46 +9338,49 @@
     </w:lvl>
   </w:abstractNum>
   <w:num w:numId="1" w16cid:durableId="1610430129">
-    <w:abstractNumId w:val="6"/>
+    <w:abstractNumId w:val="7"/>
   </w:num>
   <w:num w:numId="2" w16cid:durableId="258947612">
-    <w:abstractNumId w:val="9"/>
+    <w:abstractNumId w:val="10"/>
   </w:num>
   <w:num w:numId="3" w16cid:durableId="1083647210">
     <w:abstractNumId w:val="1"/>
   </w:num>
   <w:num w:numId="4" w16cid:durableId="1340038896">
+    <w:abstractNumId w:val="13"/>
+  </w:num>
+  <w:num w:numId="5" w16cid:durableId="1547765348">
+    <w:abstractNumId w:val="5"/>
+  </w:num>
+  <w:num w:numId="6" w16cid:durableId="364328459">
+    <w:abstractNumId w:val="11"/>
+  </w:num>
+  <w:num w:numId="7" w16cid:durableId="401874985">
+    <w:abstractNumId w:val="9"/>
+  </w:num>
+  <w:num w:numId="8" w16cid:durableId="610354897">
+    <w:abstractNumId w:val="6"/>
+  </w:num>
+  <w:num w:numId="9" w16cid:durableId="747270399">
+    <w:abstractNumId w:val="8"/>
+  </w:num>
+  <w:num w:numId="10" w16cid:durableId="1578244221">
+    <w:abstractNumId w:val="4"/>
+  </w:num>
+  <w:num w:numId="11" w16cid:durableId="1374773783">
     <w:abstractNumId w:val="12"/>
   </w:num>
-  <w:num w:numId="5" w16cid:durableId="1547765348">
-    <w:abstractNumId w:val="4"/>
-  </w:num>
-  <w:num w:numId="6" w16cid:durableId="364328459">
-    <w:abstractNumId w:val="10"/>
-  </w:num>
-  <w:num w:numId="7" w16cid:durableId="401874985">
-    <w:abstractNumId w:val="8"/>
-  </w:num>
-  <w:num w:numId="8" w16cid:durableId="610354897">
-    <w:abstractNumId w:val="5"/>
-  </w:num>
-  <w:num w:numId="9" w16cid:durableId="747270399">
-    <w:abstractNumId w:val="7"/>
-  </w:num>
-  <w:num w:numId="10" w16cid:durableId="1578244221">
-    <w:abstractNumId w:val="3"/>
-  </w:num>
-  <w:num w:numId="11" w16cid:durableId="1374773783">
-    <w:abstractNumId w:val="11"/>
-  </w:num>
   <w:num w:numId="12" w16cid:durableId="378359178">
-    <w:abstractNumId w:val="13"/>
+    <w:abstractNumId w:val="14"/>
   </w:num>
   <w:num w:numId="13" w16cid:durableId="1002200594">
     <w:abstractNumId w:val="2"/>
   </w:num>
   <w:num w:numId="14" w16cid:durableId="1220436816">
     <w:abstractNumId w:val="0"/>
+  </w:num>
+  <w:num w:numId="15" w16cid:durableId="1776708975">
+    <w:abstractNumId w:val="3"/>
   </w:num>
 </w:numbering>
 </file>

</xml_diff>